<commit_message>
feat: 贵医修改 MET14Skipping 展示
</commit_message>
<xml_diff>
--- a/WebContent/docx/泛实体瘤217基因报告-单样本-贵医.docx
+++ b/WebContent/docx/泛实体瘤217基因报告-单样本-贵医.docx
@@ -3543,15 +3543,15 @@
           <w:color w:val="auto"/>
         </w:rPr>
       </w:pPr>
-      <w:bookmarkStart w:id="0" w:name="_Toc21669"/>
-      <w:bookmarkStart w:id="1" w:name="_Toc32054"/>
-      <w:bookmarkStart w:id="2" w:name="_Toc30143_WPSOffice_Level1"/>
-      <w:bookmarkStart w:id="3" w:name="_Toc24397"/>
-      <w:bookmarkStart w:id="4" w:name="_Toc24178_WPSOffice_Level1"/>
-      <w:bookmarkStart w:id="5" w:name="_Toc27500"/>
-      <w:bookmarkStart w:id="6" w:name="_Toc10446"/>
-      <w:bookmarkStart w:id="7" w:name="_Toc4230"/>
-      <w:bookmarkStart w:id="8" w:name="_Toc21009_WPSOffice_Level1"/>
+      <w:bookmarkStart w:id="0" w:name="_Toc27500"/>
+      <w:bookmarkStart w:id="1" w:name="_Toc21669"/>
+      <w:bookmarkStart w:id="2" w:name="_Toc32054"/>
+      <w:bookmarkStart w:id="3" w:name="_Toc10446"/>
+      <w:bookmarkStart w:id="4" w:name="_Toc24397"/>
+      <w:bookmarkStart w:id="5" w:name="_Toc21009_WPSOffice_Level1"/>
+      <w:bookmarkStart w:id="6" w:name="_Toc24178_WPSOffice_Level1"/>
+      <w:bookmarkStart w:id="7" w:name="_Toc30143_WPSOffice_Level1"/>
+      <w:bookmarkStart w:id="8" w:name="_Toc4230"/>
       <w:bookmarkStart w:id="9" w:name="_Toc13806"/>
     </w:p>
     <w:p>
@@ -4982,12 +4982,6 @@
             <w:insideH w:val="single" w:color="000000" w:sz="4" w:space="0"/>
             <w:insideV w:val="single" w:color="000000" w:sz="4" w:space="0"/>
           </w:tblBorders>
-          <w:tblCellMar>
-            <w:top w:w="0" w:type="dxa"/>
-            <w:left w:w="0" w:type="dxa"/>
-            <w:bottom w:w="0" w:type="dxa"/>
-            <w:right w:w="0" w:type="dxa"/>
-          </w:tblCellMar>
         </w:tblPrEx>
         <w:trPr>
           <w:trHeight w:val="704" w:hRule="atLeast"/>
@@ -5410,8 +5404,8 @@
           <w:lang w:val="en-US" w:eastAsia="zh-CN"/>
         </w:rPr>
       </w:pPr>
-      <w:bookmarkStart w:id="15" w:name="_Toc11896"/>
-      <w:bookmarkStart w:id="16" w:name="_Toc29126"/>
+      <w:bookmarkStart w:id="15" w:name="_Toc29126"/>
+      <w:bookmarkStart w:id="16" w:name="_Toc11896"/>
       <w:bookmarkStart w:id="17" w:name="_Toc11436"/>
       <w:bookmarkStart w:id="18" w:name="_Toc149837254"/>
       <w:r>
@@ -5441,8 +5435,6 @@
         </w:rPr>
       </w:pPr>
       <w:bookmarkStart w:id="19" w:name="_Toc11205"/>
-      <w:bookmarkStart w:id="262" w:name="_GoBack"/>
-      <w:bookmarkEnd w:id="262"/>
       <w:r>
         <w:rPr>
           <w:rFonts w:hint="eastAsia"/>
@@ -6343,7 +6335,27 @@
                 <w:szCs w:val="16"/>
                 <w:lang w:eastAsia="zh-CN"/>
               </w:rPr>
-              <w:t>{{ tip.ori_variant }}</w:t>
+              <w:t>{{ tip.ori_variant</w:t>
+            </w:r>
+            <w:r>
+              <w:rPr>
+                <w:rFonts w:hint="eastAsia"/>
+                <w:spacing w:val="-1"/>
+                <w:sz w:val="16"/>
+                <w:szCs w:val="16"/>
+                <w:lang w:val="en-US" w:eastAsia="zh-CN"/>
+              </w:rPr>
+              <w:t>1</w:t>
+            </w:r>
+            <w:r>
+              <w:rPr>
+                <w:rFonts w:hint="eastAsia"/>
+                <w:spacing w:val="-1"/>
+                <w:sz w:val="16"/>
+                <w:szCs w:val="16"/>
+                <w:lang w:eastAsia="zh-CN"/>
+              </w:rPr>
+              <w:t xml:space="preserve"> }}</w:t>
             </w:r>
           </w:p>
         </w:tc>
@@ -6896,7 +6908,29 @@
                 <w:szCs w:val="16"/>
                 <w:lang w:val="en-US" w:eastAsia="zh-CN" w:bidi="ar-SA"/>
               </w:rPr>
-              <w:t>{{ tip.ori_variant }}</w:t>
+              <w:t>{{ tip.ori_variant</w:t>
+            </w:r>
+            <w:r>
+              <w:rPr>
+                <w:rFonts w:hint="eastAsia" w:cs="宋体"/>
+                <w:spacing w:val="-1"/>
+                <w:sz w:val="16"/>
+                <w:szCs w:val="16"/>
+                <w:lang w:val="en-US" w:eastAsia="zh-CN" w:bidi="ar-SA"/>
+              </w:rPr>
+              <w:t>1</w:t>
+            </w:r>
+            <w:bookmarkStart w:id="262" w:name="_GoBack"/>
+            <w:bookmarkEnd w:id="262"/>
+            <w:r>
+              <w:rPr>
+                <w:rFonts w:hint="eastAsia" w:ascii="宋体" w:hAnsi="宋体" w:eastAsia="宋体" w:cs="宋体"/>
+                <w:spacing w:val="-1"/>
+                <w:sz w:val="16"/>
+                <w:szCs w:val="16"/>
+                <w:lang w:val="en-US" w:eastAsia="zh-CN" w:bidi="ar-SA"/>
+              </w:rPr>
+              <w:t xml:space="preserve"> }}</w:t>
             </w:r>
           </w:p>
         </w:tc>
@@ -8496,8 +8530,8 @@
           <w:lang w:eastAsia="zh-CN"/>
         </w:rPr>
       </w:pPr>
-      <w:bookmarkStart w:id="20" w:name="_Toc32584"/>
-      <w:bookmarkStart w:id="21" w:name="_Toc149837255"/>
+      <w:bookmarkStart w:id="20" w:name="_Toc149837255"/>
+      <w:bookmarkStart w:id="21" w:name="_Toc32584"/>
       <w:r>
         <w:rPr>
           <w:rFonts w:hint="eastAsia" w:ascii="Times New Roman" w:hAnsi="Times New Roman" w:eastAsia="微软雅黑" w:cs="Times New Roman"/>
@@ -10675,9 +10709,9 @@
           <w:lang w:eastAsia="zh-CN"/>
         </w:rPr>
       </w:pPr>
-      <w:bookmarkStart w:id="24" w:name="_Toc8372"/>
+      <w:bookmarkStart w:id="24" w:name="_Toc9899"/>
       <w:bookmarkStart w:id="25" w:name="_Toc22846"/>
-      <w:bookmarkStart w:id="26" w:name="_Toc9899"/>
+      <w:bookmarkStart w:id="26" w:name="_Toc8372"/>
       <w:r>
         <w:rPr>
           <w:rFonts w:hint="eastAsia"/>
@@ -22477,6 +22511,12 @@
             <w:insideH w:val="dotted" w:color="45A3A7" w:sz="4" w:space="0"/>
             <w:insideV w:val="dotted" w:color="45A3A7" w:sz="4" w:space="0"/>
           </w:tblBorders>
+          <w:tblCellMar>
+            <w:top w:w="0" w:type="dxa"/>
+            <w:left w:w="108" w:type="dxa"/>
+            <w:bottom w:w="0" w:type="dxa"/>
+            <w:right w:w="108" w:type="dxa"/>
+          </w:tblCellMar>
         </w:tblPrEx>
         <w:trPr>
           <w:trHeight w:val="329" w:hRule="atLeast"/>
@@ -29597,17 +29637,17 @@
       </w:pPr>
       <w:bookmarkStart w:id="46" w:name="_Toc8951"/>
       <w:bookmarkStart w:id="47" w:name="_Toc25076"/>
-      <w:bookmarkStart w:id="48" w:name="_Toc1475"/>
-      <w:bookmarkStart w:id="49" w:name="_Toc11406"/>
+      <w:bookmarkStart w:id="48" w:name="_Toc11406"/>
+      <w:bookmarkStart w:id="49" w:name="_Toc1475"/>
       <w:bookmarkStart w:id="50" w:name="_Toc4979"/>
       <w:bookmarkStart w:id="51" w:name="_Toc27173"/>
       <w:bookmarkStart w:id="52" w:name="_Toc11896_WPSOffice_Level1"/>
-      <w:bookmarkStart w:id="53" w:name="_Toc11193_WPSOffice_Level1"/>
-      <w:bookmarkStart w:id="54" w:name="_Toc1986"/>
-      <w:bookmarkStart w:id="55" w:name="_Toc11812"/>
-      <w:bookmarkStart w:id="56" w:name="_Toc28810_WPSOffice_Level1"/>
-      <w:bookmarkStart w:id="57" w:name="_Toc20303"/>
-      <w:bookmarkStart w:id="58" w:name="_Toc1779"/>
+      <w:bookmarkStart w:id="53" w:name="_Toc1986"/>
+      <w:bookmarkStart w:id="54" w:name="_Toc11812"/>
+      <w:bookmarkStart w:id="55" w:name="_Toc28810_WPSOffice_Level1"/>
+      <w:bookmarkStart w:id="56" w:name="_Toc11193_WPSOffice_Level1"/>
+      <w:bookmarkStart w:id="57" w:name="_Toc1779"/>
+      <w:bookmarkStart w:id="58" w:name="_Toc20303"/>
       <w:r>
         <w:rPr>
           <w:rFonts w:hint="eastAsia" w:cs="Times New Roman"/>
@@ -30246,18 +30286,18 @@
           <w:lang w:eastAsia="zh-CN"/>
         </w:rPr>
       </w:pPr>
-      <w:bookmarkStart w:id="60" w:name="_Toc19099"/>
-      <w:bookmarkStart w:id="61" w:name="_Toc22484_WPSOffice_Level1"/>
-      <w:bookmarkStart w:id="62" w:name="_Toc23238"/>
-      <w:bookmarkStart w:id="63" w:name="_Toc2797"/>
-      <w:bookmarkStart w:id="64" w:name="_Toc7549"/>
+      <w:bookmarkStart w:id="60" w:name="_Toc28910_WPSOffice_Level1"/>
+      <w:bookmarkStart w:id="61" w:name="_Toc23238"/>
+      <w:bookmarkStart w:id="62" w:name="_Toc2797"/>
+      <w:bookmarkStart w:id="63" w:name="_Toc29730"/>
+      <w:bookmarkStart w:id="64" w:name="_Toc19099"/>
       <w:bookmarkStart w:id="65" w:name="_Toc16368_WPSOffice_Level1"/>
-      <w:bookmarkStart w:id="66" w:name="_Toc8182"/>
-      <w:bookmarkStart w:id="67" w:name="_Toc5898"/>
-      <w:bookmarkStart w:id="68" w:name="_Toc6864"/>
-      <w:bookmarkStart w:id="69" w:name="_Toc28910_WPSOffice_Level1"/>
-      <w:bookmarkStart w:id="70" w:name="_Toc29730"/>
-      <w:bookmarkStart w:id="71" w:name="_Toc28537"/>
+      <w:bookmarkStart w:id="66" w:name="_Toc28537"/>
+      <w:bookmarkStart w:id="67" w:name="_Toc7549"/>
+      <w:bookmarkStart w:id="68" w:name="_Toc5898"/>
+      <w:bookmarkStart w:id="69" w:name="_Toc22484_WPSOffice_Level1"/>
+      <w:bookmarkStart w:id="70" w:name="_Toc8182"/>
+      <w:bookmarkStart w:id="71" w:name="_Toc6864"/>
       <w:r>
         <w:rPr>
           <w:rFonts w:hint="eastAsia"/>
@@ -30279,8 +30319,8 @@
       <w:bookmarkEnd w:id="70"/>
       <w:bookmarkEnd w:id="71"/>
       <w:bookmarkStart w:id="72" w:name="_Toc20170_WPSOffice_Level1"/>
-      <w:bookmarkStart w:id="73" w:name="_Toc28454_WPSOffice_Level1"/>
-      <w:bookmarkStart w:id="74" w:name="_Toc26985_WPSOffice_Level1"/>
+      <w:bookmarkStart w:id="73" w:name="_Toc26985_WPSOffice_Level1"/>
+      <w:bookmarkStart w:id="74" w:name="_Toc28454_WPSOffice_Level1"/>
     </w:p>
     <w:p>
       <w:pPr>
@@ -30296,12 +30336,12 @@
         </w:rPr>
       </w:pPr>
       <w:bookmarkStart w:id="75" w:name="_Toc19280_WPSOffice_Level2"/>
-      <w:bookmarkStart w:id="76" w:name="_Toc6304_WPSOffice_Level2"/>
-      <w:bookmarkStart w:id="77" w:name="_Toc6931_WPSOffice_Level2"/>
-      <w:bookmarkStart w:id="78" w:name="_Toc31515_WPSOffice_Level2"/>
-      <w:bookmarkStart w:id="79" w:name="_Toc11193_WPSOffice_Level2"/>
-      <w:bookmarkStart w:id="80" w:name="_Toc17111_WPSOffice_Level2"/>
-      <w:bookmarkStart w:id="81" w:name="_Toc3488_WPSOffice_Level2"/>
+      <w:bookmarkStart w:id="76" w:name="_Toc6931_WPSOffice_Level2"/>
+      <w:bookmarkStart w:id="77" w:name="_Toc11193_WPSOffice_Level2"/>
+      <w:bookmarkStart w:id="78" w:name="_Toc3488_WPSOffice_Level2"/>
+      <w:bookmarkStart w:id="79" w:name="_Toc17111_WPSOffice_Level2"/>
+      <w:bookmarkStart w:id="80" w:name="_Toc6304_WPSOffice_Level2"/>
+      <w:bookmarkStart w:id="81" w:name="_Toc31515_WPSOffice_Level2"/>
       <w:r>
         <w:rPr>
           <w:rFonts w:hint="eastAsia" w:ascii="Times New Roman" w:hAnsi="Times New Roman" w:eastAsia="微软雅黑" w:cs="Times New Roman"/>
@@ -30767,13 +30807,13 @@
           <w:szCs w:val="24"/>
         </w:rPr>
       </w:pPr>
-      <w:bookmarkStart w:id="82" w:name="_Toc26578_WPSOffice_Level2"/>
-      <w:bookmarkStart w:id="83" w:name="_Toc14645_WPSOffice_Level2"/>
-      <w:bookmarkStart w:id="84" w:name="_Toc25864_WPSOffice_Level2"/>
-      <w:bookmarkStart w:id="85" w:name="_Toc2822_WPSOffice_Level2"/>
-      <w:bookmarkStart w:id="86" w:name="_Toc31138_WPSOffice_Level2"/>
-      <w:bookmarkStart w:id="87" w:name="_Toc29205_WPSOffice_Level2"/>
-      <w:bookmarkStart w:id="88" w:name="_Toc12087_WPSOffice_Level2"/>
+      <w:bookmarkStart w:id="82" w:name="_Toc14645_WPSOffice_Level2"/>
+      <w:bookmarkStart w:id="83" w:name="_Toc25864_WPSOffice_Level2"/>
+      <w:bookmarkStart w:id="84" w:name="_Toc2822_WPSOffice_Level2"/>
+      <w:bookmarkStart w:id="85" w:name="_Toc12087_WPSOffice_Level2"/>
+      <w:bookmarkStart w:id="86" w:name="_Toc29205_WPSOffice_Level2"/>
+      <w:bookmarkStart w:id="87" w:name="_Toc26578_WPSOffice_Level2"/>
+      <w:bookmarkStart w:id="88" w:name="_Toc31138_WPSOffice_Level2"/>
       <w:r>
         <w:rPr>
           <w:rFonts w:hint="eastAsia" w:ascii="Times New Roman" w:hAnsi="Times New Roman" w:eastAsia="微软雅黑" w:cs="Times New Roman"/>
@@ -30878,13 +30918,13 @@
                 <w:szCs w:val="18"/>
               </w:rPr>
             </w:pPr>
-            <w:bookmarkStart w:id="89" w:name="_Toc18696_WPSOffice_Level2"/>
-            <w:bookmarkStart w:id="90" w:name="_Toc17905_WPSOffice_Level2"/>
-            <w:bookmarkStart w:id="91" w:name="_Toc5261_WPSOffice_Level2"/>
-            <w:bookmarkStart w:id="92" w:name="_Toc31020_WPSOffice_Level2"/>
-            <w:bookmarkStart w:id="93" w:name="_Toc5660_WPSOffice_Level2"/>
-            <w:bookmarkStart w:id="94" w:name="_Toc23221_WPSOffice_Level2"/>
-            <w:bookmarkStart w:id="95" w:name="_Toc3819_WPSOffice_Level2"/>
+            <w:bookmarkStart w:id="89" w:name="_Toc31020_WPSOffice_Level2"/>
+            <w:bookmarkStart w:id="90" w:name="_Toc5660_WPSOffice_Level2"/>
+            <w:bookmarkStart w:id="91" w:name="_Toc3819_WPSOffice_Level2"/>
+            <w:bookmarkStart w:id="92" w:name="_Toc5261_WPSOffice_Level2"/>
+            <w:bookmarkStart w:id="93" w:name="_Toc17905_WPSOffice_Level2"/>
+            <w:bookmarkStart w:id="94" w:name="_Toc18696_WPSOffice_Level2"/>
+            <w:bookmarkStart w:id="95" w:name="_Toc23221_WPSOffice_Level2"/>
             <w:r>
               <w:rPr>
                 <w:rFonts w:hint="eastAsia" w:ascii="Times New Roman" w:hAnsi="Times New Roman" w:eastAsia="微软雅黑" w:cs="Times New Roman"/>
@@ -31312,14 +31352,6 @@
         <w:gridCol w:w="1409"/>
       </w:tblGrid>
       <w:tr>
-        <w:tblPrEx>
-          <w:tblCellMar>
-            <w:top w:w="0" w:type="dxa"/>
-            <w:left w:w="0" w:type="dxa"/>
-            <w:bottom w:w="0" w:type="dxa"/>
-            <w:right w:w="0" w:type="dxa"/>
-          </w:tblCellMar>
-        </w:tblPrEx>
         <w:trPr>
           <w:trHeight w:val="227" w:hRule="atLeast"/>
           <w:jc w:val="center"/>
@@ -31350,12 +31382,12 @@
               </w:rPr>
             </w:pPr>
             <w:bookmarkStart w:id="96" w:name="_Toc24626_WPSOffice_Level2"/>
-            <w:bookmarkStart w:id="97" w:name="_Toc2588_WPSOffice_Level2"/>
-            <w:bookmarkStart w:id="98" w:name="_Toc23388_WPSOffice_Level2"/>
-            <w:bookmarkStart w:id="99" w:name="_Toc15300_WPSOffice_Level2"/>
-            <w:bookmarkStart w:id="100" w:name="_Toc11554_WPSOffice_Level2"/>
-            <w:bookmarkStart w:id="101" w:name="_Toc20683_WPSOffice_Level2"/>
-            <w:bookmarkStart w:id="102" w:name="_Toc28235_WPSOffice_Level2"/>
+            <w:bookmarkStart w:id="97" w:name="_Toc23388_WPSOffice_Level2"/>
+            <w:bookmarkStart w:id="98" w:name="_Toc20683_WPSOffice_Level2"/>
+            <w:bookmarkStart w:id="99" w:name="_Toc11554_WPSOffice_Level2"/>
+            <w:bookmarkStart w:id="100" w:name="_Toc2588_WPSOffice_Level2"/>
+            <w:bookmarkStart w:id="101" w:name="_Toc28235_WPSOffice_Level2"/>
+            <w:bookmarkStart w:id="102" w:name="_Toc15300_WPSOffice_Level2"/>
             <w:r>
               <w:rPr>
                 <w:rFonts w:hint="eastAsia" w:ascii="Times New Roman" w:hAnsi="Times New Roman" w:eastAsia="微软雅黑" w:cs="Times New Roman"/>
@@ -31820,12 +31852,12 @@
                 <w:szCs w:val="18"/>
               </w:rPr>
             </w:pPr>
-            <w:bookmarkStart w:id="103" w:name="_Toc18182_WPSOffice_Level2"/>
-            <w:bookmarkStart w:id="104" w:name="_Toc22590_WPSOffice_Level2"/>
-            <w:bookmarkStart w:id="105" w:name="_Toc30071_WPSOffice_Level2"/>
-            <w:bookmarkStart w:id="106" w:name="_Toc19892_WPSOffice_Level2"/>
-            <w:bookmarkStart w:id="107" w:name="_Toc31650_WPSOffice_Level2"/>
-            <w:bookmarkStart w:id="108" w:name="_Toc16027_WPSOffice_Level2"/>
+            <w:bookmarkStart w:id="103" w:name="_Toc22590_WPSOffice_Level2"/>
+            <w:bookmarkStart w:id="104" w:name="_Toc18182_WPSOffice_Level2"/>
+            <w:bookmarkStart w:id="105" w:name="_Toc19892_WPSOffice_Level2"/>
+            <w:bookmarkStart w:id="106" w:name="_Toc30071_WPSOffice_Level2"/>
+            <w:bookmarkStart w:id="107" w:name="_Toc16027_WPSOffice_Level2"/>
+            <w:bookmarkStart w:id="108" w:name="_Toc31650_WPSOffice_Level2"/>
             <w:bookmarkStart w:id="109" w:name="_Toc12493_WPSOffice_Level2"/>
             <w:r>
               <w:rPr>
@@ -32292,12 +32324,12 @@
               </w:rPr>
             </w:pPr>
             <w:bookmarkStart w:id="110" w:name="_Toc28534_WPSOffice_Level2"/>
-            <w:bookmarkStart w:id="111" w:name="_Toc8398_WPSOffice_Level2"/>
-            <w:bookmarkStart w:id="112" w:name="_Toc19289_WPSOffice_Level2"/>
-            <w:bookmarkStart w:id="113" w:name="_Toc11689_WPSOffice_Level2"/>
-            <w:bookmarkStart w:id="114" w:name="_Toc31447_WPSOffice_Level2"/>
-            <w:bookmarkStart w:id="115" w:name="_Toc28312_WPSOffice_Level2"/>
-            <w:bookmarkStart w:id="116" w:name="_Toc20571_WPSOffice_Level2"/>
+            <w:bookmarkStart w:id="111" w:name="_Toc11689_WPSOffice_Level2"/>
+            <w:bookmarkStart w:id="112" w:name="_Toc28312_WPSOffice_Level2"/>
+            <w:bookmarkStart w:id="113" w:name="_Toc31447_WPSOffice_Level2"/>
+            <w:bookmarkStart w:id="114" w:name="_Toc20571_WPSOffice_Level2"/>
+            <w:bookmarkStart w:id="115" w:name="_Toc8398_WPSOffice_Level2"/>
+            <w:bookmarkStart w:id="116" w:name="_Toc19289_WPSOffice_Level2"/>
             <w:r>
               <w:rPr>
                 <w:rFonts w:hint="eastAsia" w:ascii="Times New Roman" w:hAnsi="Times New Roman" w:eastAsia="微软雅黑" w:cs="Times New Roman"/>
@@ -32763,13 +32795,13 @@
                 <w:szCs w:val="18"/>
               </w:rPr>
             </w:pPr>
-            <w:bookmarkStart w:id="117" w:name="_Toc5423_WPSOffice_Level2"/>
-            <w:bookmarkStart w:id="118" w:name="_Toc5164_WPSOffice_Level2"/>
-            <w:bookmarkStart w:id="119" w:name="_Toc13225_WPSOffice_Level2"/>
-            <w:bookmarkStart w:id="120" w:name="_Toc2683_WPSOffice_Level2"/>
-            <w:bookmarkStart w:id="121" w:name="_Toc6863_WPSOffice_Level2"/>
-            <w:bookmarkStart w:id="122" w:name="_Toc6170_WPSOffice_Level2"/>
-            <w:bookmarkStart w:id="123" w:name="_Toc6645_WPSOffice_Level2"/>
+            <w:bookmarkStart w:id="117" w:name="_Toc5164_WPSOffice_Level2"/>
+            <w:bookmarkStart w:id="118" w:name="_Toc6863_WPSOffice_Level2"/>
+            <w:bookmarkStart w:id="119" w:name="_Toc6170_WPSOffice_Level2"/>
+            <w:bookmarkStart w:id="120" w:name="_Toc6645_WPSOffice_Level2"/>
+            <w:bookmarkStart w:id="121" w:name="_Toc2683_WPSOffice_Level2"/>
+            <w:bookmarkStart w:id="122" w:name="_Toc5423_WPSOffice_Level2"/>
+            <w:bookmarkStart w:id="123" w:name="_Toc13225_WPSOffice_Level2"/>
             <w:r>
               <w:rPr>
                 <w:rFonts w:hint="eastAsia" w:ascii="Times New Roman" w:hAnsi="Times New Roman" w:eastAsia="微软雅黑" w:cs="Times New Roman"/>
@@ -33235,11 +33267,11 @@
               </w:rPr>
             </w:pPr>
             <w:bookmarkStart w:id="124" w:name="_Toc12046_WPSOffice_Level2"/>
-            <w:bookmarkStart w:id="125" w:name="_Toc5860_WPSOffice_Level2"/>
-            <w:bookmarkStart w:id="126" w:name="_Toc3387_WPSOffice_Level2"/>
-            <w:bookmarkStart w:id="127" w:name="_Toc29762_WPSOffice_Level2"/>
+            <w:bookmarkStart w:id="125" w:name="_Toc29762_WPSOffice_Level2"/>
+            <w:bookmarkStart w:id="126" w:name="_Toc24628_WPSOffice_Level2"/>
+            <w:bookmarkStart w:id="127" w:name="_Toc3387_WPSOffice_Level2"/>
             <w:bookmarkStart w:id="128" w:name="_Toc13817_WPSOffice_Level2"/>
-            <w:bookmarkStart w:id="129" w:name="_Toc24628_WPSOffice_Level2"/>
+            <w:bookmarkStart w:id="129" w:name="_Toc5860_WPSOffice_Level2"/>
             <w:bookmarkStart w:id="130" w:name="_Toc6323_WPSOffice_Level2"/>
             <w:r>
               <w:rPr>
@@ -33705,13 +33737,13 @@
                 <w:szCs w:val="18"/>
               </w:rPr>
             </w:pPr>
-            <w:bookmarkStart w:id="131" w:name="_Toc31905_WPSOffice_Level2"/>
-            <w:bookmarkStart w:id="132" w:name="_Toc6004_WPSOffice_Level2"/>
-            <w:bookmarkStart w:id="133" w:name="_Toc15619_WPSOffice_Level2"/>
+            <w:bookmarkStart w:id="131" w:name="_Toc11082_WPSOffice_Level2"/>
+            <w:bookmarkStart w:id="132" w:name="_Toc708_WPSOffice_Level2"/>
+            <w:bookmarkStart w:id="133" w:name="_Toc6004_WPSOffice_Level2"/>
             <w:bookmarkStart w:id="134" w:name="_Toc13244_WPSOffice_Level2"/>
-            <w:bookmarkStart w:id="135" w:name="_Toc11082_WPSOffice_Level2"/>
-            <w:bookmarkStart w:id="136" w:name="_Toc22500_WPSOffice_Level2"/>
-            <w:bookmarkStart w:id="137" w:name="_Toc708_WPSOffice_Level2"/>
+            <w:bookmarkStart w:id="135" w:name="_Toc22500_WPSOffice_Level2"/>
+            <w:bookmarkStart w:id="136" w:name="_Toc31905_WPSOffice_Level2"/>
+            <w:bookmarkStart w:id="137" w:name="_Toc15619_WPSOffice_Level2"/>
             <w:r>
               <w:rPr>
                 <w:rFonts w:hint="eastAsia" w:ascii="Times New Roman" w:hAnsi="Times New Roman" w:eastAsia="微软雅黑" w:cs="Times New Roman"/>
@@ -34176,13 +34208,13 @@
                 <w:szCs w:val="18"/>
               </w:rPr>
             </w:pPr>
-            <w:bookmarkStart w:id="138" w:name="_Toc13664_WPSOffice_Level2"/>
-            <w:bookmarkStart w:id="139" w:name="_Toc23537_WPSOffice_Level2"/>
-            <w:bookmarkStart w:id="140" w:name="_Toc7586_WPSOffice_Level2"/>
-            <w:bookmarkStart w:id="141" w:name="_Toc15479_WPSOffice_Level2"/>
+            <w:bookmarkStart w:id="138" w:name="_Toc23443_WPSOffice_Level2"/>
+            <w:bookmarkStart w:id="139" w:name="_Toc13664_WPSOffice_Level2"/>
+            <w:bookmarkStart w:id="140" w:name="_Toc23537_WPSOffice_Level2"/>
+            <w:bookmarkStart w:id="141" w:name="_Toc21560_WPSOffice_Level2"/>
             <w:bookmarkStart w:id="142" w:name="_Toc4042_WPSOffice_Level2"/>
-            <w:bookmarkStart w:id="143" w:name="_Toc21560_WPSOffice_Level2"/>
-            <w:bookmarkStart w:id="144" w:name="_Toc23443_WPSOffice_Level2"/>
+            <w:bookmarkStart w:id="143" w:name="_Toc15479_WPSOffice_Level2"/>
+            <w:bookmarkStart w:id="144" w:name="_Toc7586_WPSOffice_Level2"/>
             <w:r>
               <w:rPr>
                 <w:rFonts w:hint="eastAsia" w:ascii="Times New Roman" w:hAnsi="Times New Roman" w:eastAsia="微软雅黑" w:cs="Times New Roman"/>
@@ -34649,11 +34681,11 @@
             </w:pPr>
             <w:bookmarkStart w:id="145" w:name="_Toc2337_WPSOffice_Level2"/>
             <w:bookmarkStart w:id="146" w:name="_Toc5629_WPSOffice_Level2"/>
-            <w:bookmarkStart w:id="147" w:name="_Toc11254_WPSOffice_Level2"/>
-            <w:bookmarkStart w:id="148" w:name="_Toc10575_WPSOffice_Level2"/>
-            <w:bookmarkStart w:id="149" w:name="_Toc29193_WPSOffice_Level2"/>
-            <w:bookmarkStart w:id="150" w:name="_Toc22039_WPSOffice_Level2"/>
-            <w:bookmarkStart w:id="151" w:name="_Toc28498_WPSOffice_Level2"/>
+            <w:bookmarkStart w:id="147" w:name="_Toc10575_WPSOffice_Level2"/>
+            <w:bookmarkStart w:id="148" w:name="_Toc28498_WPSOffice_Level2"/>
+            <w:bookmarkStart w:id="149" w:name="_Toc22039_WPSOffice_Level2"/>
+            <w:bookmarkStart w:id="150" w:name="_Toc11254_WPSOffice_Level2"/>
+            <w:bookmarkStart w:id="151" w:name="_Toc29193_WPSOffice_Level2"/>
             <w:r>
               <w:rPr>
                 <w:rFonts w:hint="eastAsia" w:ascii="Times New Roman" w:hAnsi="Times New Roman" w:eastAsia="微软雅黑" w:cs="Times New Roman"/>
@@ -35120,10 +35152,10 @@
             </w:pPr>
             <w:bookmarkStart w:id="152" w:name="_Toc13246_WPSOffice_Level2"/>
             <w:bookmarkStart w:id="153" w:name="_Toc18866_WPSOffice_Level2"/>
-            <w:bookmarkStart w:id="154" w:name="_Toc8519_WPSOffice_Level2"/>
+            <w:bookmarkStart w:id="154" w:name="_Toc8985_WPSOffice_Level2"/>
             <w:bookmarkStart w:id="155" w:name="_Toc2613_WPSOffice_Level2"/>
             <w:bookmarkStart w:id="156" w:name="_Toc17668_WPSOffice_Level2"/>
-            <w:bookmarkStart w:id="157" w:name="_Toc8985_WPSOffice_Level2"/>
+            <w:bookmarkStart w:id="157" w:name="_Toc8519_WPSOffice_Level2"/>
             <w:bookmarkStart w:id="158" w:name="_Toc17621_WPSOffice_Level2"/>
             <w:r>
               <w:rPr>
@@ -35589,13 +35621,13 @@
                 <w:szCs w:val="18"/>
               </w:rPr>
             </w:pPr>
-            <w:bookmarkStart w:id="159" w:name="_Toc23413_WPSOffice_Level2"/>
-            <w:bookmarkStart w:id="160" w:name="_Toc6654_WPSOffice_Level2"/>
-            <w:bookmarkStart w:id="161" w:name="_Toc25338_WPSOffice_Level2"/>
-            <w:bookmarkStart w:id="162" w:name="_Toc12118_WPSOffice_Level2"/>
-            <w:bookmarkStart w:id="163" w:name="_Toc12027_WPSOffice_Level2"/>
-            <w:bookmarkStart w:id="164" w:name="_Toc24337_WPSOffice_Level2"/>
-            <w:bookmarkStart w:id="165" w:name="_Toc2334_WPSOffice_Level2"/>
+            <w:bookmarkStart w:id="159" w:name="_Toc6654_WPSOffice_Level2"/>
+            <w:bookmarkStart w:id="160" w:name="_Toc25338_WPSOffice_Level2"/>
+            <w:bookmarkStart w:id="161" w:name="_Toc12118_WPSOffice_Level2"/>
+            <w:bookmarkStart w:id="162" w:name="_Toc23413_WPSOffice_Level2"/>
+            <w:bookmarkStart w:id="163" w:name="_Toc2334_WPSOffice_Level2"/>
+            <w:bookmarkStart w:id="164" w:name="_Toc12027_WPSOffice_Level2"/>
+            <w:bookmarkStart w:id="165" w:name="_Toc24337_WPSOffice_Level2"/>
             <w:r>
               <w:rPr>
                 <w:rFonts w:hint="eastAsia" w:ascii="Times New Roman" w:hAnsi="Times New Roman" w:eastAsia="微软雅黑" w:cs="Times New Roman"/>
@@ -36060,13 +36092,13 @@
                 <w:szCs w:val="18"/>
               </w:rPr>
             </w:pPr>
-            <w:bookmarkStart w:id="166" w:name="_Toc20736_WPSOffice_Level2"/>
-            <w:bookmarkStart w:id="167" w:name="_Toc20271_WPSOffice_Level2"/>
-            <w:bookmarkStart w:id="168" w:name="_Toc17254_WPSOffice_Level2"/>
-            <w:bookmarkStart w:id="169" w:name="_Toc17711_WPSOffice_Level2"/>
-            <w:bookmarkStart w:id="170" w:name="_Toc6074_WPSOffice_Level2"/>
-            <w:bookmarkStart w:id="171" w:name="_Toc28807_WPSOffice_Level2"/>
-            <w:bookmarkStart w:id="172" w:name="_Toc5840_WPSOffice_Level2"/>
+            <w:bookmarkStart w:id="166" w:name="_Toc17254_WPSOffice_Level2"/>
+            <w:bookmarkStart w:id="167" w:name="_Toc28807_WPSOffice_Level2"/>
+            <w:bookmarkStart w:id="168" w:name="_Toc5840_WPSOffice_Level2"/>
+            <w:bookmarkStart w:id="169" w:name="_Toc20271_WPSOffice_Level2"/>
+            <w:bookmarkStart w:id="170" w:name="_Toc20736_WPSOffice_Level2"/>
+            <w:bookmarkStart w:id="171" w:name="_Toc6074_WPSOffice_Level2"/>
+            <w:bookmarkStart w:id="172" w:name="_Toc17711_WPSOffice_Level2"/>
             <w:r>
               <w:rPr>
                 <w:rFonts w:hint="eastAsia" w:ascii="Times New Roman" w:hAnsi="Times New Roman" w:eastAsia="微软雅黑" w:cs="Times New Roman"/>
@@ -36098,6 +36130,14 @@
         </w:tc>
       </w:tr>
       <w:tr>
+        <w:tblPrEx>
+          <w:tblCellMar>
+            <w:top w:w="0" w:type="dxa"/>
+            <w:left w:w="0" w:type="dxa"/>
+            <w:bottom w:w="0" w:type="dxa"/>
+            <w:right w:w="0" w:type="dxa"/>
+          </w:tblCellMar>
+        </w:tblPrEx>
         <w:trPr>
           <w:trHeight w:val="227" w:hRule="atLeast"/>
           <w:jc w:val="center"/>
@@ -36526,10 +36566,10 @@
             <w:bookmarkStart w:id="173" w:name="_Toc18784_WPSOffice_Level2"/>
             <w:bookmarkStart w:id="174" w:name="_Toc22623_WPSOffice_Level2"/>
             <w:bookmarkStart w:id="175" w:name="_Toc18813_WPSOffice_Level2"/>
-            <w:bookmarkStart w:id="176" w:name="_Toc24586_WPSOffice_Level2"/>
-            <w:bookmarkStart w:id="177" w:name="_Toc18295_WPSOffice_Level2"/>
-            <w:bookmarkStart w:id="178" w:name="_Toc31683_WPSOffice_Level2"/>
-            <w:bookmarkStart w:id="179" w:name="_Toc26031_WPSOffice_Level2"/>
+            <w:bookmarkStart w:id="176" w:name="_Toc26031_WPSOffice_Level2"/>
+            <w:bookmarkStart w:id="177" w:name="_Toc31683_WPSOffice_Level2"/>
+            <w:bookmarkStart w:id="178" w:name="_Toc18295_WPSOffice_Level2"/>
+            <w:bookmarkStart w:id="179" w:name="_Toc24586_WPSOffice_Level2"/>
             <w:r>
               <w:rPr>
                 <w:rFonts w:hint="eastAsia" w:ascii="Times New Roman" w:hAnsi="Times New Roman" w:eastAsia="微软雅黑" w:cs="Times New Roman"/>
@@ -37415,14 +37455,6 @@
         <w:gridCol w:w="1409"/>
       </w:tblGrid>
       <w:tr>
-        <w:tblPrEx>
-          <w:tblCellMar>
-            <w:top w:w="0" w:type="dxa"/>
-            <w:left w:w="0" w:type="dxa"/>
-            <w:bottom w:w="0" w:type="dxa"/>
-            <w:right w:w="0" w:type="dxa"/>
-          </w:tblCellMar>
-        </w:tblPrEx>
         <w:trPr>
           <w:trHeight w:val="227" w:hRule="atLeast"/>
           <w:jc w:val="center"/>
@@ -37452,13 +37484,13 @@
                 <w:szCs w:val="18"/>
               </w:rPr>
             </w:pPr>
-            <w:bookmarkStart w:id="180" w:name="_Toc31152_WPSOffice_Level2"/>
-            <w:bookmarkStart w:id="181" w:name="_Toc15930_WPSOffice_Level2"/>
+            <w:bookmarkStart w:id="180" w:name="_Toc2455_WPSOffice_Level2"/>
+            <w:bookmarkStart w:id="181" w:name="_Toc31152_WPSOffice_Level2"/>
             <w:bookmarkStart w:id="182" w:name="_Toc22167_WPSOffice_Level2"/>
             <w:bookmarkStart w:id="183" w:name="_Toc30144_WPSOffice_Level2"/>
-            <w:bookmarkStart w:id="184" w:name="_Toc11576_WPSOffice_Level2"/>
-            <w:bookmarkStart w:id="185" w:name="_Toc25837_WPSOffice_Level2"/>
-            <w:bookmarkStart w:id="186" w:name="_Toc2455_WPSOffice_Level2"/>
+            <w:bookmarkStart w:id="184" w:name="_Toc25837_WPSOffice_Level2"/>
+            <w:bookmarkStart w:id="185" w:name="_Toc15930_WPSOffice_Level2"/>
+            <w:bookmarkStart w:id="186" w:name="_Toc11576_WPSOffice_Level2"/>
             <w:r>
               <w:rPr>
                 <w:rFonts w:hint="eastAsia" w:ascii="Times New Roman" w:hAnsi="Times New Roman" w:eastAsia="微软雅黑" w:cs="Times New Roman"/>
@@ -37924,13 +37956,13 @@
                 <w:szCs w:val="18"/>
               </w:rPr>
             </w:pPr>
-            <w:bookmarkStart w:id="187" w:name="_Toc10927_WPSOffice_Level2"/>
-            <w:bookmarkStart w:id="188" w:name="_Toc6105_WPSOffice_Level2"/>
-            <w:bookmarkStart w:id="189" w:name="_Toc18298_WPSOffice_Level2"/>
-            <w:bookmarkStart w:id="190" w:name="_Toc17817_WPSOffice_Level2"/>
-            <w:bookmarkStart w:id="191" w:name="_Toc21844_WPSOffice_Level2"/>
-            <w:bookmarkStart w:id="192" w:name="_Toc24581_WPSOffice_Level2"/>
-            <w:bookmarkStart w:id="193" w:name="_Toc21218_WPSOffice_Level2"/>
+            <w:bookmarkStart w:id="187" w:name="_Toc6105_WPSOffice_Level2"/>
+            <w:bookmarkStart w:id="188" w:name="_Toc18298_WPSOffice_Level2"/>
+            <w:bookmarkStart w:id="189" w:name="_Toc21844_WPSOffice_Level2"/>
+            <w:bookmarkStart w:id="190" w:name="_Toc24581_WPSOffice_Level2"/>
+            <w:bookmarkStart w:id="191" w:name="_Toc21218_WPSOffice_Level2"/>
+            <w:bookmarkStart w:id="192" w:name="_Toc17817_WPSOffice_Level2"/>
+            <w:bookmarkStart w:id="193" w:name="_Toc10927_WPSOffice_Level2"/>
             <w:r>
               <w:rPr>
                 <w:rFonts w:hint="eastAsia" w:ascii="Times New Roman" w:hAnsi="Times New Roman" w:eastAsia="微软雅黑" w:cs="Times New Roman"/>
@@ -38395,11 +38427,11 @@
                 <w:szCs w:val="18"/>
               </w:rPr>
             </w:pPr>
-            <w:bookmarkStart w:id="194" w:name="_Toc7518_WPSOffice_Level2"/>
-            <w:bookmarkStart w:id="195" w:name="_Toc32618_WPSOffice_Level2"/>
-            <w:bookmarkStart w:id="196" w:name="_Toc26632_WPSOffice_Level2"/>
-            <w:bookmarkStart w:id="197" w:name="_Toc5805_WPSOffice_Level2"/>
-            <w:bookmarkStart w:id="198" w:name="_Toc22953_WPSOffice_Level2"/>
+            <w:bookmarkStart w:id="194" w:name="_Toc26632_WPSOffice_Level2"/>
+            <w:bookmarkStart w:id="195" w:name="_Toc5805_WPSOffice_Level2"/>
+            <w:bookmarkStart w:id="196" w:name="_Toc22953_WPSOffice_Level2"/>
+            <w:bookmarkStart w:id="197" w:name="_Toc32618_WPSOffice_Level2"/>
+            <w:bookmarkStart w:id="198" w:name="_Toc7518_WPSOffice_Level2"/>
             <w:bookmarkStart w:id="199" w:name="_Toc20673_WPSOffice_Level2"/>
             <w:bookmarkStart w:id="200" w:name="_Toc3881_WPSOffice_Level2"/>
             <w:r>
@@ -38867,9 +38899,9 @@
               </w:rPr>
             </w:pPr>
             <w:bookmarkStart w:id="201" w:name="_Toc22629_WPSOffice_Level2"/>
-            <w:bookmarkStart w:id="202" w:name="_Toc9505_WPSOffice_Level2"/>
-            <w:bookmarkStart w:id="203" w:name="_Toc14661_WPSOffice_Level2"/>
-            <w:bookmarkStart w:id="204" w:name="_Toc25299_WPSOffice_Level2"/>
+            <w:bookmarkStart w:id="202" w:name="_Toc25299_WPSOffice_Level2"/>
+            <w:bookmarkStart w:id="203" w:name="_Toc9505_WPSOffice_Level2"/>
+            <w:bookmarkStart w:id="204" w:name="_Toc14661_WPSOffice_Level2"/>
             <w:bookmarkStart w:id="205" w:name="_Toc15940_WPSOffice_Level2"/>
             <w:bookmarkStart w:id="206" w:name="_Toc22431_WPSOffice_Level2"/>
             <w:bookmarkStart w:id="207" w:name="_Toc31722_WPSOffice_Level2"/>
@@ -39337,13 +39369,13 @@
                 <w:szCs w:val="18"/>
               </w:rPr>
             </w:pPr>
-            <w:bookmarkStart w:id="208" w:name="_Toc24372_WPSOffice_Level2"/>
-            <w:bookmarkStart w:id="209" w:name="_Toc27147_WPSOffice_Level2"/>
-            <w:bookmarkStart w:id="210" w:name="_Toc20849_WPSOffice_Level2"/>
-            <w:bookmarkStart w:id="211" w:name="_Toc7607_WPSOffice_Level2"/>
-            <w:bookmarkStart w:id="212" w:name="_Toc4328_WPSOffice_Level2"/>
-            <w:bookmarkStart w:id="213" w:name="_Toc27188_WPSOffice_Level2"/>
-            <w:bookmarkStart w:id="214" w:name="_Toc5581_WPSOffice_Level2"/>
+            <w:bookmarkStart w:id="208" w:name="_Toc20849_WPSOffice_Level2"/>
+            <w:bookmarkStart w:id="209" w:name="_Toc7607_WPSOffice_Level2"/>
+            <w:bookmarkStart w:id="210" w:name="_Toc24372_WPSOffice_Level2"/>
+            <w:bookmarkStart w:id="211" w:name="_Toc4328_WPSOffice_Level2"/>
+            <w:bookmarkStart w:id="212" w:name="_Toc27188_WPSOffice_Level2"/>
+            <w:bookmarkStart w:id="213" w:name="_Toc5581_WPSOffice_Level2"/>
+            <w:bookmarkStart w:id="214" w:name="_Toc27147_WPSOffice_Level2"/>
             <w:r>
               <w:rPr>
                 <w:rFonts w:hint="eastAsia" w:ascii="Times New Roman" w:hAnsi="Times New Roman" w:eastAsia="微软雅黑" w:cs="Times New Roman"/>
@@ -39809,11 +39841,11 @@
               </w:rPr>
             </w:pPr>
             <w:bookmarkStart w:id="215" w:name="_Toc6343_WPSOffice_Level2"/>
-            <w:bookmarkStart w:id="216" w:name="_Toc11511_WPSOffice_Level2"/>
+            <w:bookmarkStart w:id="216" w:name="_Toc23854_WPSOffice_Level2"/>
             <w:bookmarkStart w:id="217" w:name="_Toc8746_WPSOffice_Level2"/>
-            <w:bookmarkStart w:id="218" w:name="_Toc26466_WPSOffice_Level2"/>
-            <w:bookmarkStart w:id="219" w:name="_Toc23854_WPSOffice_Level2"/>
-            <w:bookmarkStart w:id="220" w:name="_Toc9066_WPSOffice_Level2"/>
+            <w:bookmarkStart w:id="218" w:name="_Toc11511_WPSOffice_Level2"/>
+            <w:bookmarkStart w:id="219" w:name="_Toc9066_WPSOffice_Level2"/>
+            <w:bookmarkStart w:id="220" w:name="_Toc26466_WPSOffice_Level2"/>
             <w:bookmarkStart w:id="221" w:name="_Toc23457_WPSOffice_Level2"/>
             <w:r>
               <w:rPr>
@@ -40279,13 +40311,13 @@
                 <w:szCs w:val="18"/>
               </w:rPr>
             </w:pPr>
-            <w:bookmarkStart w:id="222" w:name="_Toc12685_WPSOffice_Level2"/>
+            <w:bookmarkStart w:id="222" w:name="_Toc1557_WPSOffice_Level2"/>
             <w:bookmarkStart w:id="223" w:name="_Toc17440_WPSOffice_Level2"/>
-            <w:bookmarkStart w:id="224" w:name="_Toc3049_WPSOffice_Level2"/>
-            <w:bookmarkStart w:id="225" w:name="_Toc6069_WPSOffice_Level2"/>
-            <w:bookmarkStart w:id="226" w:name="_Toc17938_WPSOffice_Level2"/>
-            <w:bookmarkStart w:id="227" w:name="_Toc1557_WPSOffice_Level2"/>
-            <w:bookmarkStart w:id="228" w:name="_Toc20319_WPSOffice_Level2"/>
+            <w:bookmarkStart w:id="224" w:name="_Toc17938_WPSOffice_Level2"/>
+            <w:bookmarkStart w:id="225" w:name="_Toc3049_WPSOffice_Level2"/>
+            <w:bookmarkStart w:id="226" w:name="_Toc20319_WPSOffice_Level2"/>
+            <w:bookmarkStart w:id="227" w:name="_Toc12685_WPSOffice_Level2"/>
+            <w:bookmarkStart w:id="228" w:name="_Toc6069_WPSOffice_Level2"/>
             <w:r>
               <w:rPr>
                 <w:rFonts w:hint="eastAsia" w:ascii="Times New Roman" w:hAnsi="Times New Roman" w:eastAsia="微软雅黑" w:cs="Times New Roman"/>
@@ -40750,13 +40782,13 @@
                 <w:szCs w:val="18"/>
               </w:rPr>
             </w:pPr>
-            <w:bookmarkStart w:id="229" w:name="_Toc21686_WPSOffice_Level2"/>
-            <w:bookmarkStart w:id="230" w:name="_Toc29816_WPSOffice_Level2"/>
-            <w:bookmarkStart w:id="231" w:name="_Toc27824_WPSOffice_Level2"/>
-            <w:bookmarkStart w:id="232" w:name="_Toc28180_WPSOffice_Level2"/>
-            <w:bookmarkStart w:id="233" w:name="_Toc25956_WPSOffice_Level2"/>
+            <w:bookmarkStart w:id="229" w:name="_Toc25956_WPSOffice_Level2"/>
+            <w:bookmarkStart w:id="230" w:name="_Toc19766_WPSOffice_Level2"/>
+            <w:bookmarkStart w:id="231" w:name="_Toc21686_WPSOffice_Level2"/>
+            <w:bookmarkStart w:id="232" w:name="_Toc27824_WPSOffice_Level2"/>
+            <w:bookmarkStart w:id="233" w:name="_Toc28180_WPSOffice_Level2"/>
             <w:bookmarkStart w:id="234" w:name="_Toc18427_WPSOffice_Level2"/>
-            <w:bookmarkStart w:id="235" w:name="_Toc19766_WPSOffice_Level2"/>
+            <w:bookmarkStart w:id="235" w:name="_Toc29816_WPSOffice_Level2"/>
             <w:r>
               <w:rPr>
                 <w:rFonts w:hint="eastAsia" w:ascii="Times New Roman" w:hAnsi="Times New Roman" w:eastAsia="微软雅黑" w:cs="Times New Roman"/>
@@ -41221,12 +41253,12 @@
                 <w:szCs w:val="18"/>
               </w:rPr>
             </w:pPr>
-            <w:bookmarkStart w:id="236" w:name="_Toc24661_WPSOffice_Level2"/>
+            <w:bookmarkStart w:id="236" w:name="_Toc7268_WPSOffice_Level2"/>
             <w:bookmarkStart w:id="237" w:name="_Toc27941_WPSOffice_Level2"/>
-            <w:bookmarkStart w:id="238" w:name="_Toc9870_WPSOffice_Level2"/>
-            <w:bookmarkStart w:id="239" w:name="_Toc20570_WPSOffice_Level2"/>
-            <w:bookmarkStart w:id="240" w:name="_Toc7268_WPSOffice_Level2"/>
-            <w:bookmarkStart w:id="241" w:name="_Toc8959_WPSOffice_Level2"/>
+            <w:bookmarkStart w:id="238" w:name="_Toc8959_WPSOffice_Level2"/>
+            <w:bookmarkStart w:id="239" w:name="_Toc24661_WPSOffice_Level2"/>
+            <w:bookmarkStart w:id="240" w:name="_Toc9870_WPSOffice_Level2"/>
+            <w:bookmarkStart w:id="241" w:name="_Toc20570_WPSOffice_Level2"/>
             <w:bookmarkStart w:id="242" w:name="_Toc19658_WPSOffice_Level2"/>
             <w:r>
               <w:rPr>
@@ -42566,22 +42598,22 @@
           <w:lang w:eastAsia="zh-CN"/>
         </w:rPr>
       </w:pPr>
-      <w:bookmarkStart w:id="243" w:name="_Toc5924"/>
-      <w:bookmarkStart w:id="244" w:name="_Toc3409"/>
-      <w:bookmarkStart w:id="245" w:name="_Toc15114"/>
-      <w:bookmarkStart w:id="246" w:name="_Toc13211"/>
-      <w:bookmarkStart w:id="247" w:name="_Toc27034"/>
-      <w:bookmarkStart w:id="248" w:name="_Toc107825570"/>
+      <w:bookmarkStart w:id="243" w:name="_Toc15114"/>
+      <w:bookmarkStart w:id="244" w:name="_Toc13211"/>
+      <w:bookmarkStart w:id="245" w:name="_Toc3409"/>
+      <w:bookmarkStart w:id="246" w:name="_Toc5924"/>
+      <w:bookmarkStart w:id="247" w:name="_Toc107825570"/>
+      <w:bookmarkStart w:id="248" w:name="_Toc27034"/>
       <w:bookmarkStart w:id="249" w:name="_Toc8911"/>
       <w:bookmarkStart w:id="250" w:name="_Toc27809"/>
-      <w:bookmarkStart w:id="251" w:name="_Toc15630"/>
-      <w:bookmarkStart w:id="252" w:name="_Toc11901"/>
-      <w:bookmarkStart w:id="253" w:name="_Toc4503"/>
-      <w:bookmarkStart w:id="254" w:name="_Toc19584_WPSOffice_Level1"/>
-      <w:bookmarkStart w:id="255" w:name="_Toc22162_WPSOffice_Level1"/>
-      <w:bookmarkStart w:id="256" w:name="_Toc14611_WPSOffice_Level1"/>
-      <w:bookmarkStart w:id="257" w:name="_Toc17792_WPSOffice_Level2"/>
-      <w:bookmarkStart w:id="258" w:name="_Toc13275"/>
+      <w:bookmarkStart w:id="251" w:name="_Toc11901"/>
+      <w:bookmarkStart w:id="252" w:name="_Toc4503"/>
+      <w:bookmarkStart w:id="253" w:name="_Toc15630"/>
+      <w:bookmarkStart w:id="254" w:name="_Toc22162_WPSOffice_Level1"/>
+      <w:bookmarkStart w:id="255" w:name="_Toc17792_WPSOffice_Level2"/>
+      <w:bookmarkStart w:id="256" w:name="_Toc13275"/>
+      <w:bookmarkStart w:id="257" w:name="_Toc14611_WPSOffice_Level1"/>
+      <w:bookmarkStart w:id="258" w:name="_Toc19584_WPSOffice_Level1"/>
       <w:bookmarkStart w:id="259" w:name="_Toc22623"/>
       <w:r>
         <w:rPr>

</xml_diff>